<commit_message>
auto: publish 2026-07-10 23:02:21
</commit_message>
<xml_diff>
--- a/docs/日更/2026/07/20260709量化FOF.docx
+++ b/docs/日更/2026/07/20260709量化FOF.docx
@@ -500,6 +500,71 @@
       </w:pPr>
     </w:p>
     <w:p>
+      <w:pPr>
+        <w:pStyle w:val="BodyText"/>
+      </w:pPr>
+      <w:r>
+        <w:t xml:space="preserve">补充说明一下，这个社群只对合格投资者开放。</w:t>
+      </w:r>
+    </w:p>
+    <w:p>
+      <w:pPr>
+        <w:pStyle w:val="BodyText"/>
+      </w:pPr>
+      <w:r>
+        <w:t xml:space="preserve">合格投资者的标准是：具有2年以上投资经历，且满足以下三项条件之一：</w:t>
+      </w:r>
+    </w:p>
+    <w:p>
+      <w:pPr>
+        <w:numPr>
+          <w:ilvl w:val="0"/>
+          <w:numId w:val="1001"/>
+        </w:numPr>
+      </w:pPr>
+      <w:r>
+        <w:t xml:space="preserve">家庭金融净资产不低于300万元</w:t>
+      </w:r>
+    </w:p>
+    <w:p>
+      <w:pPr>
+        <w:numPr>
+          <w:ilvl w:val="0"/>
+          <w:numId w:val="1001"/>
+        </w:numPr>
+      </w:pPr>
+      <w:r>
+        <w:t xml:space="preserve">家庭金融资产不低于500万元</w:t>
+      </w:r>
+    </w:p>
+    <w:p>
+      <w:pPr>
+        <w:numPr>
+          <w:ilvl w:val="0"/>
+          <w:numId w:val="1001"/>
+        </w:numPr>
+      </w:pPr>
+      <w:r>
+        <w:t xml:space="preserve">近三年本人年均收入不低于40万元。</w:t>
+      </w:r>
+    </w:p>
+    <w:p>
+      <w:pPr>
+        <w:pStyle w:val="FirstParagraph"/>
+      </w:pPr>
+      <w:r>
+        <w:t xml:space="preserve">如果暂时没到这个门槛也没关系，这个群可能不太适合你，可以继续关注四维轮动组合的内容。</w:t>
+      </w:r>
+    </w:p>
+    <w:p>
+      <w:pPr>
+        <w:pStyle w:val="BodyText"/>
+      </w:pPr>
+      <w:r>
+        <w:t xml:space="preserve">如果符合条件，欢迎加入量化交流群，一起交流。</w:t>
+      </w:r>
+    </w:p>
+    <w:p>
       <w:r>
         <w:pict>
           <v:rect style="width:0;height:1.5pt" o:hralign="center" o:hrstd="t" o:hr="t"/>
@@ -622,8 +687,123 @@
       </w:pPr>
     </w:lvl>
   </w:abstractNum>
+  <w:abstractNum w:abstractNumId="99411">
+    <w:nsid w:val="ea454b4c"/>
+    <w:multiLevelType w:val="multilevel"/>
+    <w:lvl w:ilvl="0">
+      <w:start w:val="1"/>
+      <w:numFmt w:val="decimal"/>
+      <w:lvlText w:val="%1."/>
+      <w:lvlJc w:val="left"/>
+      <w:pPr>
+        <w:ind w:left="720" w:hanging="480"/>
+      </w:pPr>
+    </w:lvl>
+    <w:lvl w:ilvl="1">
+      <w:start w:val="1"/>
+      <w:numFmt w:val="decimal"/>
+      <w:lvlText w:val="%2."/>
+      <w:lvlJc w:val="left"/>
+      <w:pPr>
+        <w:ind w:left="1440" w:hanging="480"/>
+      </w:pPr>
+    </w:lvl>
+    <w:lvl w:ilvl="2">
+      <w:start w:val="1"/>
+      <w:numFmt w:val="decimal"/>
+      <w:lvlText w:val="%3."/>
+      <w:lvlJc w:val="left"/>
+      <w:pPr>
+        <w:ind w:left="2160" w:hanging="480"/>
+      </w:pPr>
+    </w:lvl>
+    <w:lvl w:ilvl="3">
+      <w:start w:val="1"/>
+      <w:numFmt w:val="decimal"/>
+      <w:lvlText w:val="%4."/>
+      <w:lvlJc w:val="left"/>
+      <w:pPr>
+        <w:ind w:left="2880" w:hanging="480"/>
+      </w:pPr>
+    </w:lvl>
+    <w:lvl w:ilvl="4">
+      <w:start w:val="1"/>
+      <w:numFmt w:val="decimal"/>
+      <w:lvlText w:val="%5."/>
+      <w:lvlJc w:val="left"/>
+      <w:pPr>
+        <w:ind w:left="3600" w:hanging="480"/>
+      </w:pPr>
+    </w:lvl>
+    <w:lvl w:ilvl="5">
+      <w:start w:val="1"/>
+      <w:numFmt w:val="decimal"/>
+      <w:lvlText w:val="%6."/>
+      <w:lvlJc w:val="left"/>
+      <w:pPr>
+        <w:ind w:left="4320" w:hanging="480"/>
+      </w:pPr>
+    </w:lvl>
+    <w:lvl w:ilvl="6">
+      <w:start w:val="1"/>
+      <w:numFmt w:val="decimal"/>
+      <w:lvlText w:val="%7."/>
+      <w:lvlJc w:val="left"/>
+      <w:pPr>
+        <w:ind w:left="5040" w:hanging="480"/>
+      </w:pPr>
+    </w:lvl>
+    <w:lvl w:ilvl="7">
+      <w:start w:val="1"/>
+      <w:numFmt w:val="decimal"/>
+      <w:lvlText w:val="%8."/>
+      <w:lvlJc w:val="left"/>
+      <w:pPr>
+        <w:ind w:left="5760" w:hanging="480"/>
+      </w:pPr>
+    </w:lvl>
+    <w:lvl w:ilvl="8">
+      <w:start w:val="1"/>
+      <w:numFmt w:val="decimal"/>
+      <w:lvlText w:val="%9."/>
+      <w:lvlJc w:val="left"/>
+      <w:pPr>
+        <w:ind w:left="6480" w:hanging="480"/>
+      </w:pPr>
+    </w:lvl>
+  </w:abstractNum>
   <w:num w:numId="1000">
     <w:abstractNumId w:val="990"/>
+  </w:num>
+  <w:num w:numId="1001">
+    <w:abstractNumId w:val="99411"/>
+    <w:lvlOverride w:ilvl="0">
+      <w:startOverride w:val="1"/>
+    </w:lvlOverride>
+    <w:lvlOverride w:ilvl="1">
+      <w:startOverride w:val="1"/>
+    </w:lvlOverride>
+    <w:lvlOverride w:ilvl="2">
+      <w:startOverride w:val="1"/>
+    </w:lvlOverride>
+    <w:lvlOverride w:ilvl="3">
+      <w:startOverride w:val="1"/>
+    </w:lvlOverride>
+    <w:lvlOverride w:ilvl="4">
+      <w:startOverride w:val="1"/>
+    </w:lvlOverride>
+    <w:lvlOverride w:ilvl="5">
+      <w:startOverride w:val="1"/>
+    </w:lvlOverride>
+    <w:lvlOverride w:ilvl="6">
+      <w:startOverride w:val="1"/>
+    </w:lvlOverride>
+    <w:lvlOverride w:ilvl="7">
+      <w:startOverride w:val="1"/>
+    </w:lvlOverride>
+    <w:lvlOverride w:ilvl="8">
+      <w:startOverride w:val="1"/>
+    </w:lvlOverride>
   </w:num>
 </w:numbering>
 </file>

</xml_diff>